<commit_message>
feat: templates line spacing, font changed
</commit_message>
<xml_diff>
--- a/scripts/cv_template.docx
+++ b/scripts/cv_template.docx
@@ -38,7 +38,6 @@
                 <w:szCs w:val="48"/>
               </w:rPr>
             </w:pPr>
-            <w:proofErr w:type="spellStart"/>
             <w:r>
               <w:rPr>
                 <w:rFonts w:ascii="나눔명조" w:eastAsia="나눔명조" w:hAnsi="나눔명조" w:cs="Times New Roman" w:hint="eastAsia"/>
@@ -47,7 +46,6 @@
               </w:rPr>
               <w:t>강현승</w:t>
             </w:r>
-            <w:proofErr w:type="spellEnd"/>
           </w:p>
         </w:tc>
         <w:tc>
@@ -57,17 +55,17 @@
           </w:tcPr>
           <w:p>
             <w:pPr>
-              <w:spacing w:line="336" w:lineRule="auto"/>
+              <w:spacing w:line="360" w:lineRule="auto"/>
               <w:ind w:leftChars="8" w:left="14"/>
               <w:jc w:val="both"/>
               <w:rPr>
-                <w:rFonts w:ascii="NanumGothic" w:hAnsi="NanumGothic"/>
+                <w:rFonts w:ascii="나눔고딕" w:hAnsi="나눔고딕"/>
                 <w:szCs w:val="20"/>
               </w:rPr>
             </w:pPr>
             <w:r>
               <w:rPr>
-                <w:rFonts w:ascii="NanumGothic" w:hAnsi="NanumGothic"/>
+                <w:rFonts w:ascii="나눔고딕" w:hAnsi="나눔고딕"/>
                 <w:b/>
                 <w:bCs/>
                 <w:szCs w:val="20"/>
@@ -76,7 +74,7 @@
             </w:r>
             <w:r>
               <w:rPr>
-                <w:rFonts w:ascii="NanumGothic" w:hAnsi="NanumGothic"/>
+                <w:rFonts w:ascii="나눔고딕" w:hAnsi="나눔고딕"/>
                 <w:szCs w:val="20"/>
               </w:rPr>
               <w:t xml:space="preserve"> </w:t>
@@ -85,7 +83,7 @@
               <w:r>
                 <w:rPr>
                   <w:rStyle w:val="ab"/>
-                  <w:rFonts w:ascii="NanumGothic" w:hAnsi="NanumGothic"/>
+                  <w:rFonts w:ascii="나눔고딕" w:hAnsi="나눔고딕"/>
                   <w:szCs w:val="20"/>
                 </w:rPr>
                 <w:t>hyeonseungkang@outlook.com</w:t>
@@ -94,17 +92,17 @@
           </w:p>
           <w:p>
             <w:pPr>
-              <w:spacing w:line="336" w:lineRule="auto"/>
+              <w:spacing w:line="360" w:lineRule="auto"/>
               <w:ind w:leftChars="8" w:left="14"/>
               <w:jc w:val="both"/>
               <w:rPr>
-                <w:rFonts w:ascii="NanumGothic" w:hAnsi="NanumGothic"/>
+                <w:rFonts w:ascii="나눔고딕" w:hAnsi="나눔고딕"/>
                 <w:szCs w:val="20"/>
               </w:rPr>
             </w:pPr>
             <w:r>
               <w:rPr>
-                <w:rFonts w:ascii="NanumGothic" w:hAnsi="NanumGothic"/>
+                <w:rFonts w:ascii="나눔고딕" w:hAnsi="나눔고딕"/>
                 <w:b/>
                 <w:bCs/>
                 <w:szCs w:val="20"/>
@@ -113,35 +111,35 @@
             </w:r>
             <w:r>
               <w:rPr>
-                <w:rFonts w:ascii="NanumGothic" w:hAnsi="NanumGothic"/>
+                <w:rFonts w:ascii="나눔고딕" w:hAnsi="나눔고딕"/>
                 <w:szCs w:val="20"/>
               </w:rPr>
               <w:t xml:space="preserve"> +8210</w:t>
             </w:r>
             <w:r>
               <w:rPr>
-                <w:rFonts w:ascii="NanumGothic" w:hAnsi="NanumGothic"/>
+                <w:rFonts w:ascii="나눔고딕" w:hAnsi="나눔고딕"/>
                 <w:szCs w:val="20"/>
               </w:rPr>
               <w:t>5934</w:t>
             </w:r>
             <w:r>
               <w:rPr>
-                <w:rFonts w:ascii="NanumGothic" w:hAnsi="NanumGothic"/>
+                <w:rFonts w:ascii="나눔고딕" w:hAnsi="나눔고딕"/>
                 <w:szCs w:val="20"/>
               </w:rPr>
               <w:t>055</w:t>
             </w:r>
             <w:r>
               <w:rPr>
-                <w:rFonts w:ascii="NanumGothic" w:hAnsi="NanumGothic"/>
+                <w:rFonts w:ascii="나눔고딕" w:hAnsi="나눔고딕"/>
                 <w:szCs w:val="20"/>
               </w:rPr>
               <w:t>2</w:t>
             </w:r>
             <w:r>
               <w:rPr>
-                <w:rFonts w:ascii="NanumGothic" w:hAnsi="NanumGothic" w:hint="eastAsia"/>
+                <w:rFonts w:ascii="나눔고딕" w:hAnsi="나눔고딕" w:hint="eastAsia"/>
                 <w:szCs w:val="20"/>
               </w:rPr>
               <w:t xml:space="preserve"> </w:t>
@@ -158,7 +156,7 @@
             </w:pPr>
             <w:r>
               <w:rPr>
-                <w:rFonts w:ascii="NanumGothic" w:hAnsi="NanumGothic"/>
+                <w:rFonts w:ascii="나눔고딕" w:hAnsi="나눔고딕"/>
                 <w:b/>
                 <w:bCs/>
                 <w:szCs w:val="20"/>
@@ -167,7 +165,7 @@
             </w:r>
             <w:r>
               <w:rPr>
-                <w:rFonts w:ascii="NanumGothic" w:hAnsi="NanumGothic"/>
+                <w:rFonts w:ascii="나눔고딕" w:hAnsi="나눔고딕"/>
                 <w:szCs w:val="20"/>
               </w:rPr>
               <w:t xml:space="preserve"> </w:t>
@@ -176,7 +174,7 @@
               <w:r>
                 <w:rPr>
                   <w:rStyle w:val="ab"/>
-                  <w:rFonts w:ascii="NanumGothic" w:hAnsi="NanumGothic"/>
+                  <w:rFonts w:ascii="나눔고딕" w:hAnsi="나눔고딕"/>
                   <w:szCs w:val="20"/>
                 </w:rPr>
                 <w:t>https://hyeonseungkang.github.io</w:t>
@@ -184,7 +182,7 @@
             </w:hyperlink>
             <w:r>
               <w:rPr>
-                <w:rFonts w:ascii="NanumGothic" w:hAnsi="NanumGothic"/>
+                <w:rFonts w:ascii="나눔고딕" w:hAnsi="나눔고딕"/>
                 <w:szCs w:val="20"/>
               </w:rPr>
               <w:t xml:space="preserve"> </w:t>
@@ -234,13 +232,13 @@
           <w:p>
             <w:pPr>
               <w:rPr>
-                <w:rFonts w:ascii="NanumGothic" w:hAnsi="NanumGothic"/>
+                <w:rFonts w:ascii="나눔고딕" w:hAnsi="나눔고딕"/>
                 <w:szCs w:val="18"/>
               </w:rPr>
             </w:pPr>
             <w:r>
               <w:rPr>
-                <w:rFonts w:ascii="NanumGothic" w:hAnsi="NanumGothic" w:hint="eastAsia"/>
+                <w:rFonts w:ascii="나눔고딕" w:hAnsi="나눔고딕" w:hint="eastAsia"/>
                 <w:szCs w:val="18"/>
               </w:rPr>
               <w:t>경력명</w:t>
@@ -250,20 +248,18 @@
             <w:pPr>
               <w:ind w:leftChars="400" w:left="677"/>
               <w:rPr>
-                <w:rFonts w:ascii="NanumGothic" w:hAnsi="NanumGothic"/>
+                <w:rFonts w:ascii="나눔고딕" w:hAnsi="나눔고딕"/>
                 <w:szCs w:val="18"/>
               </w:rPr>
             </w:pPr>
-            <w:proofErr w:type="spellStart"/>
-            <w:r>
-              <w:rPr>
-                <w:rFonts w:ascii="NanumGothic" w:hAnsi="NanumGothic" w:hint="eastAsia"/>
+            <w:r>
+              <w:rPr>
+                <w:rFonts w:ascii="나눔고딕" w:hAnsi="나눔고딕" w:hint="eastAsia"/>
                 <w:color w:val="595959" w:themeColor="text1" w:themeTint="A6"/>
                 <w:szCs w:val="18"/>
               </w:rPr>
               <w:t>경력상세</w:t>
             </w:r>
-            <w:proofErr w:type="spellEnd"/>
           </w:p>
         </w:tc>
         <w:tc>
@@ -273,7 +269,7 @@
           <w:p>
             <w:pPr>
               <w:rPr>
-                <w:rFonts w:ascii="NanumGothic" w:hAnsi="NanumGothic"/>
+                <w:rFonts w:ascii="나눔고딕" w:hAnsi="나눔고딕"/>
                 <w:szCs w:val="18"/>
               </w:rPr>
             </w:pPr>
@@ -281,76 +277,76 @@
           <w:p>
             <w:pPr>
               <w:rPr>
-                <w:rFonts w:ascii="NanumGothic" w:hAnsi="NanumGothic"/>
+                <w:rFonts w:ascii="나눔고딕" w:hAnsi="나눔고딕"/>
                 <w:szCs w:val="18"/>
               </w:rPr>
             </w:pPr>
             <w:r>
               <w:rPr>
-                <w:rFonts w:ascii="NanumGothic" w:hAnsi="NanumGothic" w:hint="eastAsia"/>
+                <w:rFonts w:ascii="나눔고딕" w:hAnsi="나눔고딕" w:hint="eastAsia"/>
                 <w:szCs w:val="18"/>
               </w:rPr>
               <w:t>0000</w:t>
             </w:r>
             <w:r>
               <w:rPr>
-                <w:rFonts w:ascii="NanumGothic" w:hAnsi="NanumGothic" w:hint="eastAsia"/>
+                <w:rFonts w:ascii="나눔고딕" w:hAnsi="나눔고딕" w:hint="eastAsia"/>
                 <w:szCs w:val="18"/>
               </w:rPr>
               <w:t xml:space="preserve">. </w:t>
             </w:r>
             <w:r>
               <w:rPr>
-                <w:rFonts w:ascii="NanumGothic" w:hAnsi="NanumGothic" w:hint="eastAsia"/>
+                <w:rFonts w:ascii="나눔고딕" w:hAnsi="나눔고딕" w:hint="eastAsia"/>
                 <w:szCs w:val="18"/>
               </w:rPr>
               <w:t>0</w:t>
             </w:r>
             <w:r>
               <w:rPr>
-                <w:rFonts w:ascii="NanumGothic" w:hAnsi="NanumGothic" w:hint="eastAsia"/>
+                <w:rFonts w:ascii="나눔고딕" w:hAnsi="나눔고딕" w:hint="eastAsia"/>
                 <w:szCs w:val="18"/>
               </w:rPr>
               <w:t xml:space="preserve">. </w:t>
             </w:r>
             <w:r>
               <w:rPr>
-                <w:rFonts w:ascii="NanumGothic" w:hAnsi="NanumGothic"/>
+                <w:rFonts w:ascii="나눔고딕" w:hAnsi="나눔고딕"/>
                 <w:szCs w:val="18"/>
               </w:rPr>
               <w:t>–</w:t>
             </w:r>
             <w:r>
               <w:rPr>
-                <w:rFonts w:ascii="NanumGothic" w:hAnsi="NanumGothic" w:hint="eastAsia"/>
+                <w:rFonts w:ascii="나눔고딕" w:hAnsi="나눔고딕" w:hint="eastAsia"/>
                 <w:szCs w:val="18"/>
               </w:rPr>
               <w:t xml:space="preserve"> </w:t>
             </w:r>
             <w:r>
               <w:rPr>
-                <w:rFonts w:ascii="NanumGothic" w:hAnsi="NanumGothic" w:hint="eastAsia"/>
+                <w:rFonts w:ascii="나눔고딕" w:hAnsi="나눔고딕" w:hint="eastAsia"/>
                 <w:szCs w:val="18"/>
               </w:rPr>
               <w:t>0000</w:t>
             </w:r>
             <w:r>
               <w:rPr>
-                <w:rFonts w:ascii="NanumGothic" w:hAnsi="NanumGothic" w:hint="eastAsia"/>
+                <w:rFonts w:ascii="나눔고딕" w:hAnsi="나눔고딕" w:hint="eastAsia"/>
                 <w:szCs w:val="18"/>
               </w:rPr>
               <w:t xml:space="preserve">. </w:t>
             </w:r>
             <w:r>
               <w:rPr>
-                <w:rFonts w:ascii="NanumGothic" w:hAnsi="NanumGothic" w:hint="eastAsia"/>
+                <w:rFonts w:ascii="나눔고딕" w:hAnsi="나눔고딕" w:hint="eastAsia"/>
                 <w:szCs w:val="18"/>
               </w:rPr>
               <w:t>0</w:t>
             </w:r>
             <w:r>
               <w:rPr>
-                <w:rFonts w:ascii="NanumGothic" w:hAnsi="NanumGothic" w:hint="eastAsia"/>
+                <w:rFonts w:ascii="나눔고딕" w:hAnsi="나눔고딕" w:hint="eastAsia"/>
                 <w:szCs w:val="18"/>
               </w:rPr>
               <w:t xml:space="preserve">. </w:t>
@@ -403,90 +399,68 @@
           <w:p>
             <w:pPr>
               <w:rPr>
-                <w:rFonts w:ascii="NanumGothic" w:hAnsi="NanumGothic"/>
+                <w:rFonts w:ascii="나눔고딕" w:hAnsi="나눔고딕"/>
                 <w:szCs w:val="18"/>
               </w:rPr>
             </w:pPr>
-            <w:proofErr w:type="spellStart"/>
-            <w:r>
-              <w:rPr>
-                <w:rFonts w:ascii="NanumGothic" w:hAnsi="NanumGothic" w:hint="eastAsia"/>
-                <w:szCs w:val="18"/>
-              </w:rPr>
-              <w:t>활동명</w:t>
-            </w:r>
-            <w:proofErr w:type="spellEnd"/>
-            <w:r>
-              <w:rPr>
-                <w:rFonts w:ascii="NanumGothic" w:hAnsi="NanumGothic" w:hint="eastAsia"/>
-                <w:szCs w:val="18"/>
-              </w:rPr>
-              <w:t>1</w:t>
+            <w:r>
+              <w:rPr>
+                <w:rFonts w:ascii="나눔고딕" w:hAnsi="나눔고딕" w:hint="eastAsia"/>
+                <w:szCs w:val="18"/>
+              </w:rPr>
+              <w:t>활동명1</w:t>
             </w:r>
           </w:p>
           <w:p>
             <w:pPr>
               <w:ind w:leftChars="400" w:left="677"/>
               <w:rPr>
-                <w:rFonts w:ascii="NanumGothic" w:hAnsi="NanumGothic"/>
+                <w:rFonts w:ascii="나눔고딕" w:hAnsi="나눔고딕"/>
                 <w:color w:val="595959" w:themeColor="text1" w:themeTint="A6"/>
                 <w:szCs w:val="18"/>
               </w:rPr>
             </w:pPr>
-            <w:proofErr w:type="spellStart"/>
-            <w:r>
-              <w:rPr>
-                <w:rFonts w:ascii="NanumGothic" w:hAnsi="NanumGothic" w:hint="eastAsia"/>
+            <w:r>
+              <w:rPr>
+                <w:rFonts w:ascii="나눔고딕" w:hAnsi="나눔고딕" w:hint="eastAsia"/>
                 <w:color w:val="595959" w:themeColor="text1" w:themeTint="A6"/>
                 <w:szCs w:val="18"/>
               </w:rPr>
               <w:t>활동상세</w:t>
             </w:r>
-            <w:proofErr w:type="spellEnd"/>
           </w:p>
           <w:p>
             <w:pPr>
               <w:rPr>
-                <w:rFonts w:ascii="NanumGothic" w:hAnsi="NanumGothic"/>
+                <w:rFonts w:ascii="나눔고딕" w:hAnsi="나눔고딕"/>
                 <w:szCs w:val="18"/>
               </w:rPr>
             </w:pPr>
-            <w:proofErr w:type="spellStart"/>
-            <w:r>
-              <w:rPr>
-                <w:rFonts w:ascii="NanumGothic" w:hAnsi="NanumGothic" w:hint="eastAsia"/>
-                <w:szCs w:val="18"/>
-              </w:rPr>
-              <w:t>활동명</w:t>
-            </w:r>
-            <w:proofErr w:type="spellEnd"/>
-            <w:r>
-              <w:rPr>
-                <w:rFonts w:ascii="NanumGothic" w:hAnsi="NanumGothic" w:hint="eastAsia"/>
-                <w:szCs w:val="18"/>
-              </w:rPr>
-              <w:t>2</w:t>
+            <w:r>
+              <w:rPr>
+                <w:rFonts w:ascii="나눔고딕" w:hAnsi="나눔고딕" w:hint="eastAsia"/>
+                <w:szCs w:val="18"/>
+              </w:rPr>
+              <w:t>활동명2</w:t>
             </w:r>
           </w:p>
           <w:p>
             <w:pPr>
               <w:ind w:leftChars="400" w:left="677"/>
               <w:rPr>
-                <w:rFonts w:ascii="NanumGothic" w:hAnsi="NanumGothic"/>
+                <w:rFonts w:ascii="나눔고딕" w:hAnsi="나눔고딕"/>
                 <w:color w:val="595959" w:themeColor="text1" w:themeTint="A6"/>
                 <w:szCs w:val="18"/>
               </w:rPr>
             </w:pPr>
-            <w:proofErr w:type="spellStart"/>
-            <w:r>
-              <w:rPr>
-                <w:rFonts w:ascii="NanumGothic" w:hAnsi="NanumGothic" w:hint="eastAsia"/>
+            <w:r>
+              <w:rPr>
+                <w:rFonts w:ascii="나눔고딕" w:hAnsi="나눔고딕" w:hint="eastAsia"/>
                 <w:color w:val="595959" w:themeColor="text1" w:themeTint="A6"/>
                 <w:szCs w:val="18"/>
               </w:rPr>
               <w:t>활동상세</w:t>
             </w:r>
-            <w:proofErr w:type="spellEnd"/>
           </w:p>
         </w:tc>
         <w:tc>
@@ -496,7 +470,7 @@
           <w:p>
             <w:pPr>
               <w:rPr>
-                <w:rFonts w:ascii="NanumGothic" w:hAnsi="NanumGothic"/>
+                <w:rFonts w:ascii="나눔고딕" w:hAnsi="나눔고딕"/>
                 <w:szCs w:val="18"/>
               </w:rPr>
             </w:pPr>
@@ -504,48 +478,48 @@
           <w:p>
             <w:pPr>
               <w:rPr>
-                <w:rFonts w:ascii="NanumGothic" w:hAnsi="NanumGothic"/>
+                <w:rFonts w:ascii="나눔고딕" w:hAnsi="나눔고딕"/>
                 <w:szCs w:val="18"/>
               </w:rPr>
             </w:pPr>
             <w:r>
               <w:rPr>
-                <w:rFonts w:ascii="NanumGothic" w:hAnsi="NanumGothic" w:hint="eastAsia"/>
+                <w:rFonts w:ascii="나눔고딕" w:hAnsi="나눔고딕" w:hint="eastAsia"/>
                 <w:szCs w:val="18"/>
               </w:rPr>
               <w:t>0000</w:t>
             </w:r>
             <w:r>
               <w:rPr>
-                <w:rFonts w:ascii="NanumGothic" w:hAnsi="NanumGothic" w:hint="eastAsia"/>
+                <w:rFonts w:ascii="나눔고딕" w:hAnsi="나눔고딕" w:hint="eastAsia"/>
                 <w:szCs w:val="18"/>
               </w:rPr>
               <w:t xml:space="preserve">. </w:t>
             </w:r>
             <w:r>
               <w:rPr>
-                <w:rFonts w:ascii="NanumGothic" w:hAnsi="NanumGothic" w:hint="eastAsia"/>
+                <w:rFonts w:ascii="나눔고딕" w:hAnsi="나눔고딕" w:hint="eastAsia"/>
                 <w:szCs w:val="18"/>
               </w:rPr>
               <w:t>0</w:t>
             </w:r>
             <w:r>
               <w:rPr>
-                <w:rFonts w:ascii="NanumGothic" w:hAnsi="NanumGothic" w:hint="eastAsia"/>
+                <w:rFonts w:ascii="나눔고딕" w:hAnsi="나눔고딕" w:hint="eastAsia"/>
                 <w:szCs w:val="18"/>
               </w:rPr>
               <w:t xml:space="preserve">. </w:t>
             </w:r>
             <w:r>
               <w:rPr>
-                <w:rFonts w:ascii="NanumGothic" w:hAnsi="NanumGothic"/>
+                <w:rFonts w:ascii="나눔고딕" w:hAnsi="나눔고딕"/>
                 <w:szCs w:val="18"/>
               </w:rPr>
               <w:t>–</w:t>
             </w:r>
             <w:r>
               <w:rPr>
-                <w:rFonts w:ascii="NanumGothic" w:hAnsi="NanumGothic" w:hint="eastAsia"/>
+                <w:rFonts w:ascii="나눔고딕" w:hAnsi="나눔고딕" w:hint="eastAsia"/>
                 <w:szCs w:val="18"/>
               </w:rPr>
               <w:t xml:space="preserve"> 현재</w:t>
@@ -554,7 +528,7 @@
           <w:p>
             <w:pPr>
               <w:rPr>
-                <w:rFonts w:ascii="NanumGothic" w:hAnsi="NanumGothic"/>
+                <w:rFonts w:ascii="나눔고딕" w:hAnsi="나눔고딕"/>
                 <w:szCs w:val="18"/>
               </w:rPr>
             </w:pPr>
@@ -562,62 +536,62 @@
           <w:p>
             <w:pPr>
               <w:rPr>
-                <w:rFonts w:ascii="NanumGothic" w:hAnsi="NanumGothic"/>
+                <w:rFonts w:ascii="나눔고딕" w:hAnsi="나눔고딕"/>
                 <w:szCs w:val="18"/>
               </w:rPr>
             </w:pPr>
             <w:r>
               <w:rPr>
-                <w:rFonts w:ascii="NanumGothic" w:hAnsi="NanumGothic" w:hint="eastAsia"/>
+                <w:rFonts w:ascii="나눔고딕" w:hAnsi="나눔고딕" w:hint="eastAsia"/>
                 <w:szCs w:val="18"/>
               </w:rPr>
               <w:t>0000</w:t>
             </w:r>
             <w:r>
               <w:rPr>
-                <w:rFonts w:ascii="NanumGothic" w:hAnsi="NanumGothic"/>
+                <w:rFonts w:ascii="나눔고딕" w:hAnsi="나눔고딕"/>
                 <w:szCs w:val="18"/>
               </w:rPr>
               <w:t xml:space="preserve">. </w:t>
             </w:r>
             <w:r>
               <w:rPr>
-                <w:rFonts w:ascii="NanumGothic" w:hAnsi="NanumGothic" w:hint="eastAsia"/>
+                <w:rFonts w:ascii="나눔고딕" w:hAnsi="나눔고딕" w:hint="eastAsia"/>
                 <w:szCs w:val="18"/>
               </w:rPr>
               <w:t>0</w:t>
             </w:r>
             <w:r>
               <w:rPr>
-                <w:rFonts w:ascii="NanumGothic" w:hAnsi="NanumGothic"/>
+                <w:rFonts w:ascii="나눔고딕" w:hAnsi="나눔고딕"/>
                 <w:szCs w:val="18"/>
               </w:rPr>
               <w:t xml:space="preserve">. – </w:t>
             </w:r>
             <w:r>
               <w:rPr>
-                <w:rFonts w:ascii="NanumGothic" w:hAnsi="NanumGothic" w:hint="eastAsia"/>
+                <w:rFonts w:ascii="나눔고딕" w:hAnsi="나눔고딕" w:hint="eastAsia"/>
                 <w:szCs w:val="18"/>
               </w:rPr>
               <w:t>0000</w:t>
             </w:r>
             <w:r>
               <w:rPr>
-                <w:rFonts w:ascii="NanumGothic" w:hAnsi="NanumGothic"/>
+                <w:rFonts w:ascii="나눔고딕" w:hAnsi="나눔고딕"/>
                 <w:szCs w:val="18"/>
               </w:rPr>
               <w:t xml:space="preserve">. </w:t>
             </w:r>
             <w:r>
               <w:rPr>
-                <w:rFonts w:ascii="NanumGothic" w:hAnsi="NanumGothic" w:hint="eastAsia"/>
+                <w:rFonts w:ascii="나눔고딕" w:hAnsi="나눔고딕" w:hint="eastAsia"/>
                 <w:szCs w:val="18"/>
               </w:rPr>
               <w:t>0</w:t>
             </w:r>
             <w:r>
               <w:rPr>
-                <w:rFonts w:ascii="NanumGothic" w:hAnsi="NanumGothic"/>
+                <w:rFonts w:ascii="나눔고딕" w:hAnsi="나눔고딕"/>
                 <w:szCs w:val="18"/>
               </w:rPr>
               <w:t>.</w:t>
@@ -626,7 +600,7 @@
           <w:p>
             <w:pPr>
               <w:rPr>
-                <w:rFonts w:ascii="NanumGothic" w:hAnsi="NanumGothic"/>
+                <w:rFonts w:ascii="나눔고딕" w:hAnsi="나눔고딕"/>
                 <w:szCs w:val="18"/>
               </w:rPr>
             </w:pPr>
@@ -678,24 +652,22 @@
           <w:p>
             <w:pPr>
               <w:rPr>
-                <w:rFonts w:ascii="NanumGothic" w:hAnsi="NanumGothic"/>
+                <w:rFonts w:ascii="나눔고딕" w:hAnsi="나눔고딕"/>
                 <w:szCs w:val="18"/>
               </w:rPr>
             </w:pPr>
-            <w:proofErr w:type="spellStart"/>
-            <w:r>
-              <w:rPr>
-                <w:rFonts w:ascii="NanumGothic" w:hAnsi="NanumGothic" w:hint="eastAsia"/>
+            <w:r>
+              <w:rPr>
+                <w:rFonts w:ascii="나눔고딕" w:hAnsi="나눔고딕" w:hint="eastAsia"/>
                 <w:szCs w:val="18"/>
               </w:rPr>
               <w:t>자격명</w:t>
             </w:r>
-            <w:proofErr w:type="spellEnd"/>
           </w:p>
           <w:p>
             <w:pPr>
               <w:rPr>
-                <w:rFonts w:ascii="NanumGothic" w:hAnsi="NanumGothic"/>
+                <w:rFonts w:ascii="나눔고딕" w:hAnsi="나눔고딕"/>
                 <w:szCs w:val="18"/>
               </w:rPr>
             </w:pPr>
@@ -708,13 +680,13 @@
           <w:p>
             <w:pPr>
               <w:rPr>
-                <w:rFonts w:ascii="NanumGothic" w:hAnsi="NanumGothic"/>
+                <w:rFonts w:ascii="나눔고딕" w:hAnsi="나눔고딕"/>
                 <w:szCs w:val="18"/>
               </w:rPr>
             </w:pPr>
             <w:r>
               <w:rPr>
-                <w:rFonts w:ascii="NanumGothic" w:hAnsi="NanumGothic" w:hint="eastAsia"/>
+                <w:rFonts w:ascii="나눔고딕" w:hAnsi="나눔고딕" w:hint="eastAsia"/>
                 <w:szCs w:val="18"/>
               </w:rPr>
               <w:t>자격상세</w:t>
@@ -723,7 +695,7 @@
           <w:p>
             <w:pPr>
               <w:rPr>
-                <w:rFonts w:ascii="NanumGothic" w:hAnsi="NanumGothic"/>
+                <w:rFonts w:ascii="나눔고딕" w:hAnsi="나눔고딕"/>
                 <w:szCs w:val="18"/>
               </w:rPr>
             </w:pPr>
@@ -736,13 +708,13 @@
           <w:p>
             <w:pPr>
               <w:rPr>
-                <w:rFonts w:ascii="NanumGothic" w:hAnsi="NanumGothic"/>
+                <w:rFonts w:ascii="나눔고딕" w:hAnsi="나눔고딕"/>
                 <w:szCs w:val="18"/>
               </w:rPr>
             </w:pPr>
             <w:r>
               <w:rPr>
-                <w:rFonts w:ascii="NanumGothic" w:hAnsi="NanumGothic" w:hint="eastAsia"/>
+                <w:rFonts w:ascii="나눔고딕" w:hAnsi="나눔고딕" w:hint="eastAsia"/>
                 <w:szCs w:val="18"/>
               </w:rPr>
               <w:t>0000. 0. 00.</w:t>
@@ -1267,7 +1239,7 @@
       <w:spacing w:line="288" w:lineRule="auto"/>
     </w:pPr>
     <w:rPr>
-      <w:rFonts w:eastAsia="NanumGothic"/>
+      <w:rFonts w:eastAsia="나눔고딕"/>
       <w:sz w:val="18"/>
     </w:rPr>
   </w:style>

</xml_diff>